<commit_message>
Corregir metadatos y referencias del informe final
</commit_message>
<xml_diff>
--- a/Semana3/informe/f3_s03_grupo6.docx
+++ b/Semana3/informe/f3_s03_grupo6.docx
@@ -9133,7 +9133,13 @@
           <w:color w:val="182638"/>
           <w:sz w:val="22"/>
         </w:rPr>
-        <w:t>El notebook consolida la evidencia computacional de RA2 y RA3 en un flujo reproducible: control del entorno, regresión, ajuste paramétrico, clasificación, EDA, preprocesamiento, entrenamiento, evaluación y control de artefactos. La corrida archivada contiene 31 celdas, 15 celdas de código ejecutadas secuencialmente (1–15) y cero errores.</w:t>
+      </w:r>
+      <w:r>
+        <w:rPr>
+          <w:rFonts w:ascii="Calibri" w:hAnsi="Calibri"/>
+          <w:sz w:val="22"/>
+        </w:rPr>
+        <w:t>El notebook consolida la evidencia computacional de RA2 y RA3 en un flujo reproducible: control del entorno, regresión, ajuste paramétrico, clasificación, EDA, preprocesamiento, entrenamiento, evaluación y control de artefactos. La corrida archivada contiene 31 celdas, 15 celdas de código ejecutadas secuencialmente (1–15) y cero errores. La implementación se apoya en scikit-learn como infraestructura principal de modelamiento (Pedregosa et al., 2011). Repositorio público: https://github.com/edocontreras/mcdi504-machine-learning-1.</w:t>
       </w:r>
     </w:p>
     <w:tbl>
@@ -14041,49 +14047,30 @@
           <w:color w:val="182638"/>
           <w:sz w:val="20"/>
         </w:rPr>
-        <w:t>James, G., Witten, D., Hastie, T., Tibshirani, R., &amp; Taylor, J. (2023). An Introduction to Statistical Learning: With Applications in Python. Springer.</w:t>
       </w:r>
-    </w:p>
-    <w:p>
-      <w:pPr>
-        <w:spacing w:after="80"/>
-        <w:ind w:left="360" w:hanging="360"/>
-      </w:pPr>
       <w:r>
         <w:rPr>
           <w:rFonts w:ascii="Calibri" w:hAnsi="Calibri"/>
-          <w:color w:val="182638"/>
+          <w:i w:val="0"/>
           <w:sz w:val="20"/>
         </w:rPr>
-        <w:t>Pedregosa, F., Varoquaux, G., Gramfort, A., Michel, V., Thirion, B., Grisel, O., et al. (2011). Scikit-learn: Machine learning in Python. Journal of Machine Learning Research, 12, 2825-2830.</w:t>
+        <w:t xml:space="preserve">James, G., Witten, D., Hastie, T., Tibshirani, R., &amp; Taylor, J. (2023). </w:t>
       </w:r>
-    </w:p>
-    <w:p>
-      <w:pPr>
-        <w:spacing w:after="80"/>
-        <w:ind w:left="360" w:hanging="360"/>
-      </w:pPr>
       <w:r>
         <w:rPr>
           <w:rFonts w:ascii="Calibri" w:hAnsi="Calibri"/>
-          <w:color w:val="182638"/>
+          <w:i/>
           <w:sz w:val="20"/>
         </w:rPr>
-        <w:t>Ruete Zúñiga, D. (2026). Redes neuronales [Apunte]. Universidad Andrés Bello.</w:t>
+        <w:t>An Introduction to Statistical Learning: With Applications in Python</w:t>
       </w:r>
-    </w:p>
-    <w:p>
-      <w:pPr>
-        <w:spacing w:after="80"/>
-        <w:ind w:left="360" w:hanging="360"/>
-      </w:pPr>
       <w:r>
         <w:rPr>
           <w:rFonts w:ascii="Calibri" w:hAnsi="Calibri"/>
-          <w:color w:val="182638"/>
+          <w:i w:val="0"/>
           <w:sz w:val="20"/>
         </w:rPr>
-        <w:t>Universidad Andrés Bello. (2026). Fase 3: modelos de clasificación supervisada. Implementación, ajuste, evaluación y comparación [Presentación de apoyo, MCDI504].</w:t>
+        <w:t>. Springer.</w:t>
       </w:r>
     </w:p>
     <w:p>
@@ -14099,7 +14086,28 @@
         </w:rPr>
       </w:r>
       <w:r>
-        <w:t>scikit-learn Developers. (2026a). MLPClassifier. Scikit-learn documentation. https://scikit-learn.org/stable/modules/generated/sklearn.neural_network.MLPClassifier.html</w:t>
+        <w:rPr>
+          <w:rFonts w:ascii="Calibri" w:hAnsi="Calibri"/>
+          <w:i w:val="0"/>
+          <w:sz w:val="20"/>
+        </w:rPr>
+        <w:t xml:space="preserve">Pedregosa, F., Varoquaux, G., Gramfort, A., Michel, V., Thirion, B., Grisel, O., et al. (2011). Scikit-learn: Machine learning in Python. </w:t>
+      </w:r>
+      <w:r>
+        <w:rPr>
+          <w:rFonts w:ascii="Calibri" w:hAnsi="Calibri"/>
+          <w:i/>
+          <w:sz w:val="20"/>
+        </w:rPr>
+        <w:t>Journal of Machine Learning Research, 12</w:t>
+      </w:r>
+      <w:r>
+        <w:rPr>
+          <w:rFonts w:ascii="Calibri" w:hAnsi="Calibri"/>
+          <w:i w:val="0"/>
+          <w:sz w:val="20"/>
+        </w:rPr>
+        <w:t>, 2825-2830.</w:t>
       </w:r>
     </w:p>
     <w:p>
@@ -14115,7 +14123,28 @@
         </w:rPr>
       </w:r>
       <w:r>
-        <w:t>scikit-learn Developers. (2026b). GridSearchCV. Scikit-learn documentation. https://scikit-learn.org/stable/modules/generated/sklearn.model_selection.GridSearchCV.html</w:t>
+        <w:rPr>
+          <w:rFonts w:ascii="Calibri" w:hAnsi="Calibri"/>
+          <w:i w:val="0"/>
+          <w:sz w:val="20"/>
+        </w:rPr>
+        <w:t xml:space="preserve">Ruete Zúñiga, D. (2026). </w:t>
+      </w:r>
+      <w:r>
+        <w:rPr>
+          <w:rFonts w:ascii="Calibri" w:hAnsi="Calibri"/>
+          <w:i/>
+          <w:sz w:val="20"/>
+        </w:rPr>
+        <w:t>Redes neuronales</w:t>
+      </w:r>
+      <w:r>
+        <w:rPr>
+          <w:rFonts w:ascii="Calibri" w:hAnsi="Calibri"/>
+          <w:i w:val="0"/>
+          <w:sz w:val="20"/>
+        </w:rPr>
+        <w:t xml:space="preserve"> [Apunte]. Universidad Andrés Bello.</w:t>
       </w:r>
     </w:p>
     <w:p>
@@ -14131,7 +14160,142 @@
         </w:rPr>
       </w:r>
       <w:r>
-        <w:t>scikit-learn Developers. (2026c). Column Transformer with Mixed Types. Scikit-learn documentation. https://scikit-learn.org/stable/auto_examples/compose/plot_column_transformer_mixed_types.html</w:t>
+        <w:rPr>
+          <w:rFonts w:ascii="Calibri" w:hAnsi="Calibri"/>
+          <w:i w:val="0"/>
+          <w:sz w:val="20"/>
+        </w:rPr>
+        <w:t xml:space="preserve">scikit-learn Developers. (2026a). </w:t>
+      </w:r>
+      <w:r>
+        <w:rPr>
+          <w:rFonts w:ascii="Calibri" w:hAnsi="Calibri"/>
+          <w:i/>
+          <w:sz w:val="20"/>
+        </w:rPr>
+        <w:t>MLPClassifier</w:t>
+      </w:r>
+      <w:r>
+        <w:rPr>
+          <w:rFonts w:ascii="Calibri" w:hAnsi="Calibri"/>
+          <w:i w:val="0"/>
+          <w:sz w:val="20"/>
+        </w:rPr>
+        <w:t>. Scikit-learn documentation. https://scikit-learn.org/stable/modules/generated/sklearn.neural_network.MLPClassifier.html</w:t>
+      </w:r>
+    </w:p>
+    <w:p>
+      <w:pPr>
+        <w:spacing w:after="80"/>
+        <w:ind w:left="360" w:hanging="360"/>
+      </w:pPr>
+      <w:r>
+        <w:rPr>
+          <w:rFonts w:ascii="Calibri" w:hAnsi="Calibri"/>
+          <w:color w:val="182638"/>
+          <w:sz w:val="20"/>
+        </w:rPr>
+      </w:r>
+      <w:r/>
+      <w:r>
+        <w:rPr>
+          <w:rFonts w:ascii="Calibri" w:hAnsi="Calibri"/>
+          <w:i w:val="0"/>
+          <w:sz w:val="20"/>
+        </w:rPr>
+        <w:t xml:space="preserve">scikit-learn Developers. (2026b). </w:t>
+      </w:r>
+      <w:r>
+        <w:rPr>
+          <w:rFonts w:ascii="Calibri" w:hAnsi="Calibri"/>
+          <w:i/>
+          <w:sz w:val="20"/>
+        </w:rPr>
+        <w:t>GridSearchCV</w:t>
+      </w:r>
+      <w:r>
+        <w:rPr>
+          <w:rFonts w:ascii="Calibri" w:hAnsi="Calibri"/>
+          <w:i w:val="0"/>
+          <w:sz w:val="20"/>
+        </w:rPr>
+        <w:t>. Scikit-learn documentation. https://scikit-learn.org/stable/modules/generated/sklearn.model_selection.GridSearchCV.html</w:t>
+      </w:r>
+    </w:p>
+    <w:p>
+      <w:pPr>
+        <w:spacing w:after="80"/>
+        <w:ind w:left="360" w:hanging="360"/>
+      </w:pPr>
+      <w:r>
+        <w:rPr>
+          <w:rFonts w:ascii="Calibri" w:hAnsi="Calibri"/>
+          <w:color w:val="182638"/>
+          <w:sz w:val="20"/>
+        </w:rPr>
+      </w:r>
+      <w:r/>
+      <w:r>
+        <w:rPr>
+          <w:rFonts w:ascii="Calibri" w:hAnsi="Calibri"/>
+          <w:i w:val="0"/>
+          <w:sz w:val="20"/>
+        </w:rPr>
+        <w:t xml:space="preserve">scikit-learn Developers. (2026c). </w:t>
+      </w:r>
+      <w:r>
+        <w:rPr>
+          <w:rFonts w:ascii="Calibri" w:hAnsi="Calibri"/>
+          <w:i/>
+          <w:sz w:val="20"/>
+        </w:rPr>
+        <w:t>Column Transformer with Mixed Types</w:t>
+      </w:r>
+      <w:r>
+        <w:rPr>
+          <w:rFonts w:ascii="Calibri" w:hAnsi="Calibri"/>
+          <w:i w:val="0"/>
+          <w:sz w:val="20"/>
+        </w:rPr>
+        <w:t>. Scikit-learn documentation. https://scikit-learn.org/stable/auto_examples/compose/plot_column_transformer_mixed_types.html</w:t>
+      </w:r>
+    </w:p>
+    <w:p>
+      <w:pPr>
+        <w:spacing w:after="80"/>
+        <w:ind w:left="360" w:hanging="360"/>
+      </w:pPr>
+      <w:r>
+        <w:rPr>
+          <w:rFonts w:ascii="Calibri" w:hAnsi="Calibri"/>
+          <w:color w:val="182638"/>
+          <w:sz w:val="20"/>
+        </w:rPr>
+      </w:r>
+      <w:r/>
+      <w:r>
+        <w:rPr>
+          <w:rFonts w:ascii="Calibri" w:hAnsi="Calibri"/>
+          <w:i w:val="0"/>
+          <w:sz w:val="20"/>
+        </w:rPr>
+        <w:t xml:space="preserve">Universidad Andrés Bello. (2026). </w:t>
+      </w:r>
+      <w:r>
+        <w:rPr>
+          <w:rFonts w:ascii="Calibri" w:hAnsi="Calibri"/>
+          <w:i/>
+          <w:sz w:val="20"/>
+        </w:rPr>
+        <w:t>Fase 3: modelos de clasificación supervisada. Implementación, ajuste, evaluación y comparación</w:t>
+      </w:r>
+      <w:r>
+        <w:rPr>
+          <w:rFonts w:ascii="Calibri" w:hAnsi="Calibri"/>
+          <w:i w:val="0"/>
+          <w:sz w:val="20"/>
+        </w:rPr>
+        <w:t xml:space="preserve"> [Presentación de apoyo, MCDI504].</w:t>
       </w:r>
     </w:p>
     <w:p>

</xml_diff>